<commit_message>
added baseline disk image for Kingston SSD, file hash used as file size exceeded file size limit
</commit_message>
<xml_diff>
--- a/Literature.docx
+++ b/Literature.docx
@@ -3,8 +3,21 @@
 <w:document xmlns:wpc="http://schemas.microsoft.com/office/word/2010/wordprocessingCanvas" xmlns:cx="http://schemas.microsoft.com/office/drawing/2014/chartex" xmlns:cx1="http://schemas.microsoft.com/office/drawing/2015/9/8/chartex" xmlns:cx2="http://schemas.microsoft.com/office/drawing/2015/10/21/chartex" xmlns:cx3="http://schemas.microsoft.com/office/drawing/2016/5/9/chartex" xmlns:cx4="http://schemas.microsoft.com/office/drawing/2016/5/10/chartex" xmlns:cx5="http://schemas.microsoft.com/office/drawing/2016/5/11/chartex" xmlns:cx6="http://schemas.microsoft.com/office/drawing/2016/5/12/chartex" xmlns:cx7="http://schemas.microsoft.com/office/drawing/2016/5/13/chartex" xmlns:cx8="http://schemas.microsoft.com/office/drawing/2016/5/14/chartex" xmlns:mc="http://schemas.openxmlformats.org/markup-compatibility/2006" xmlns:aink="http://schemas.microsoft.com/office/drawing/2016/ink" xmlns:am3d="http://schemas.microsoft.com/office/drawing/2017/model3d" xmlns:o="urn:schemas-microsoft-com:office:office" xmlns:oel="http://schemas.microsoft.com/office/2019/extlst" xmlns:r="http://schemas.openxmlformats.org/officeDocument/2006/relationships" xmlns:m="http://schemas.openxmlformats.org/officeDocument/2006/math" xmlns:v="urn:schemas-microsoft-com:vml" xmlns:wp14="http://schemas.microsoft.com/office/word/2010/wordprocessingDrawing" xmlns:wp="http://schemas.openxmlformats.org/drawingml/2006/wordprocessingDrawing" xmlns:w10="urn:schemas-microsoft-com:office:word" xmlns:w="http://schemas.openxmlformats.org/wordprocessingml/2006/main" xmlns:w14="http://schemas.microsoft.com/office/word/2010/wordml" xmlns:w15="http://schemas.microsoft.com/office/word/2012/wordml" xmlns:w16cex="http://schemas.microsoft.com/office/word/2018/wordml/cex" xmlns:w16cid="http://schemas.microsoft.com/office/word/2016/wordml/cid" xmlns:w16="http://schemas.microsoft.com/office/word/2018/wordml" xmlns:w16du="http://schemas.microsoft.com/office/word/2023/wordml/word16du" xmlns:w16sdtdh="http://schemas.microsoft.com/office/word/2020/wordml/sdtdatahash" xmlns:w16sdtfl="http://schemas.microsoft.com/office/word/2024/wordml/sdtformatlock" xmlns:w16se="http://schemas.microsoft.com/office/word/2015/wordml/symex" xmlns:wpg="http://schemas.microsoft.com/office/word/2010/wordprocessingGroup" xmlns:wpi="http://schemas.microsoft.com/office/word/2010/wordprocessingInk" xmlns:wne="http://schemas.microsoft.com/office/word/2006/wordml" xmlns:wps="http://schemas.microsoft.com/office/word/2010/wordprocessingShape" mc:Ignorable="w14 w15 w16se w16cid w16 w16cex w16sdtdh w16sdtfl w16du wp14">
   <w:body>
     <w:p>
-      <w:r>
-        <w:t>Septya, R.E., Wijayanto, A., Abdillah, M.F. and Djumhadi, D. (2026). Analysis of the Effectiveness of Data Sanitization Methods on Windows Against Data Recovery Using a Digital Forensic Approach. </w:t>
+      <w:proofErr w:type="spellStart"/>
+      <w:r>
+        <w:t>Septya</w:t>
+      </w:r>
+      <w:proofErr w:type="spellEnd"/>
+      <w:r>
+        <w:t xml:space="preserve">, R.E., </w:t>
+      </w:r>
+      <w:proofErr w:type="spellStart"/>
+      <w:r>
+        <w:t>Wijayanto</w:t>
+      </w:r>
+      <w:proofErr w:type="spellEnd"/>
+      <w:r>
+        <w:t>, A., Abdillah, M.F. and Djumhadi, D. (2026). Analysis of the Effectiveness of Data Sanitization Methods on Windows Against Data Recovery Using a Digital Forensic Approach. </w:t>
       </w:r>
       <w:r>
         <w:rPr>
@@ -14,7 +27,15 @@
         <w:t>Journal of Applied Informatics and Computing</w:t>
       </w:r>
       <w:r>
-        <w:t>, [online] 10(2), pp.1329–1337. doi:10.30871/jaic.v10i2.12256.</w:t>
+        <w:t>, [online] 10(2), pp.1329–1337. doi:10.30871/</w:t>
+      </w:r>
+      <w:proofErr w:type="gramStart"/>
+      <w:r>
+        <w:t>jaic.v</w:t>
+      </w:r>
+      <w:proofErr w:type="gramEnd"/>
+      <w:r>
+        <w:t>10i2.12256.</w:t>
       </w:r>
     </w:p>
     <w:p>
@@ -151,6 +172,127 @@
         <w:t>Scenario Average (%) = (Volume average + Integrity average + Functionality average) / 3</w:t>
       </w:r>
     </w:p>
+    <w:p>
+      <w:pPr>
+        <w:rPr>
+          <w:i/>
+          <w:iCs/>
+        </w:rPr>
+      </w:pPr>
+    </w:p>
+    <w:p>
+      <w:pPr>
+        <w:rPr>
+          <w:i/>
+          <w:iCs/>
+        </w:rPr>
+      </w:pPr>
+    </w:p>
+    <w:p>
+      <w:pPr>
+        <w:rPr>
+          <w:i/>
+          <w:iCs/>
+        </w:rPr>
+      </w:pPr>
+    </w:p>
+    <w:p>
+      <w:pPr>
+        <w:rPr>
+          <w:i/>
+          <w:iCs/>
+        </w:rPr>
+      </w:pPr>
+    </w:p>
+    <w:p>
+      <w:pPr>
+        <w:rPr>
+          <w:i/>
+          <w:iCs/>
+        </w:rPr>
+      </w:pPr>
+    </w:p>
+    <w:p>
+      <w:pPr>
+        <w:rPr>
+          <w:i/>
+          <w:iCs/>
+        </w:rPr>
+      </w:pPr>
+    </w:p>
+    <w:p>
+      <w:r>
+        <w:rPr>
+          <w:b/>
+          <w:bCs/>
+          <w:u w:val="single"/>
+        </w:rPr>
+        <w:lastRenderedPageBreak/>
+        <w:t>Reading/References</w:t>
+      </w:r>
+    </w:p>
+    <w:p>
+      <w:r>
+        <w:t>Zhou, G. (2025). Systematic analysis to the evolution and future of computer storage system. </w:t>
+      </w:r>
+      <w:r>
+        <w:rPr>
+          <w:i/>
+          <w:iCs/>
+        </w:rPr>
+        <w:t>IET conference proceedings.</w:t>
+      </w:r>
+      <w:r>
+        <w:t>, 2024(19), pp.312–316. doi:10.1049/icp.2024.4001.</w:t>
+      </w:r>
+    </w:p>
+    <w:p>
+      <w:r>
+        <w:t xml:space="preserve">Du, X., Hargreaves, C., Sheppard, J., Anda, F., </w:t>
+      </w:r>
+      <w:proofErr w:type="spellStart"/>
+      <w:r>
+        <w:t>Sayakkara</w:t>
+      </w:r>
+      <w:proofErr w:type="spellEnd"/>
+      <w:r>
+        <w:t xml:space="preserve">, A., Le-Khac, N.-A. and Scanlon, M. (2020). </w:t>
+      </w:r>
+      <w:proofErr w:type="spellStart"/>
+      <w:r>
+        <w:t>SoK</w:t>
+      </w:r>
+      <w:proofErr w:type="spellEnd"/>
+      <w:r>
+        <w:t>: Exploring the State of the Art and the Future Potential of Artificial Intelligence in Digital Forensic Investigation. </w:t>
+      </w:r>
+      <w:r>
+        <w:rPr>
+          <w:i/>
+          <w:iCs/>
+        </w:rPr>
+        <w:t>Proceedings of the 15th International Conference on Availability, Reliability and Security</w:t>
+      </w:r>
+      <w:r>
+        <w:t>, [online] pp.1–10. doi:10.1145/3407023.3407068.</w:t>
+      </w:r>
+    </w:p>
+    <w:p>
+      <w:r>
+        <w:t>Garfinkel, S.L. and Shelat, A. (2003). Remembrance of data passed: a study of disk sanitization practices. </w:t>
+      </w:r>
+      <w:r>
+        <w:rPr>
+          <w:i/>
+          <w:iCs/>
+        </w:rPr>
+        <w:t>IEEE Security &amp; Privacy</w:t>
+      </w:r>
+      <w:r>
+        <w:t>, [online] 1(1), pp.17–27. doi:10.1109/msecp.2003.1176992.</w:t>
+      </w:r>
+    </w:p>
+    <w:p/>
     <w:sectPr>
       <w:pgSz w:w="11906" w:h="16838"/>
       <w:pgMar w:top="1440" w:right="1440" w:bottom="1440" w:left="1440" w:header="708" w:footer="708" w:gutter="0"/>

</xml_diff>

<commit_message>
added Secure Erase data for Kingston SSD
</commit_message>
<xml_diff>
--- a/Literature.docx
+++ b/Literature.docx
@@ -181,29 +181,21 @@
       </w:pPr>
     </w:p>
     <w:p>
-      <w:pPr>
-        <w:rPr>
-          <w:i/>
-          <w:iCs/>
-        </w:rPr>
-      </w:pPr>
-    </w:p>
-    <w:p>
-      <w:pPr>
-        <w:rPr>
-          <w:i/>
-          <w:iCs/>
-        </w:rPr>
-      </w:pPr>
-    </w:p>
-    <w:p>
-      <w:pPr>
-        <w:rPr>
-          <w:i/>
-          <w:iCs/>
-        </w:rPr>
-      </w:pPr>
-    </w:p>
+      <w:r>
+        <w:t>Kingston SSD secure erase function:</w:t>
+      </w:r>
+    </w:p>
+    <w:p>
+      <w:hyperlink r:id="rId6" w:history="1">
+        <w:r>
+          <w:rPr>
+            <w:rStyle w:val="Hyperlink"/>
+          </w:rPr>
+          <w:t>https://media.kingston.com/support/downloads/secure-erase-user-guide_ksm.pdf</w:t>
+        </w:r>
+      </w:hyperlink>
+    </w:p>
+    <w:p/>
     <w:p>
       <w:pPr>
         <w:rPr>
@@ -1003,6 +995,7 @@
   <w:style w:type="character" w:default="1" w:styleId="DefaultParagraphFont">
     <w:name w:val="Default Paragraph Font"/>
     <w:uiPriority w:val="1"/>
+    <w:semiHidden/>
     <w:unhideWhenUsed/>
   </w:style>
   <w:style w:type="table" w:default="1" w:styleId="TableNormal">

</xml_diff>

<commit_message>
added initial folders for Samsung SSD
</commit_message>
<xml_diff>
--- a/Literature.docx
+++ b/Literature.docx
@@ -284,6 +284,59 @@
         <w:t>, [online] 1(1), pp.17–27. doi:10.1109/msecp.2003.1176992.</w:t>
       </w:r>
     </w:p>
+    <w:p>
+      <w:r>
+        <w:t>Desnoyers, P. (2010). Empirical evaluation of NAND flash memory performance. </w:t>
+      </w:r>
+      <w:r>
+        <w:rPr>
+          <w:i/>
+          <w:iCs/>
+        </w:rPr>
+        <w:t>ACM SIGOPS Operating Systems Review</w:t>
+      </w:r>
+      <w:r>
+        <w:t>, 44(1), pp.50–54. doi:10.1145/1740390.1740402.</w:t>
+      </w:r>
+    </w:p>
+    <w:p>
+      <w:proofErr w:type="spellStart"/>
+      <w:r>
+        <w:t>Septya</w:t>
+      </w:r>
+      <w:proofErr w:type="spellEnd"/>
+      <w:r>
+        <w:t xml:space="preserve">, R.E., </w:t>
+      </w:r>
+      <w:proofErr w:type="spellStart"/>
+      <w:r>
+        <w:t>Wijayanto</w:t>
+      </w:r>
+      <w:proofErr w:type="spellEnd"/>
+      <w:r>
+        <w:t>, A., Abdillah, M.F. and Djumhadi, D. (2026). Analysis of the Effectiveness of Data Sanitization Methods on Windows Against Data Recovery Using a Digital Forensic Approach. </w:t>
+      </w:r>
+      <w:r>
+        <w:rPr>
+          <w:i/>
+          <w:iCs/>
+        </w:rPr>
+        <w:t>Journal of Applied Informatics and Computing</w:t>
+      </w:r>
+      <w:r>
+        <w:t>, 10(2), pp.1329–1337. doi:10.30871/</w:t>
+      </w:r>
+      <w:proofErr w:type="gramStart"/>
+      <w:r>
+        <w:t>jaic.v</w:t>
+      </w:r>
+      <w:proofErr w:type="gramEnd"/>
+      <w:r>
+        <w:t>10i2.12256.</w:t>
+      </w:r>
+    </w:p>
+    <w:p/>
+    <w:p/>
     <w:p/>
     <w:sectPr>
       <w:pgSz w:w="11906" w:h="16838"/>
@@ -995,7 +1048,6 @@
   <w:style w:type="character" w:default="1" w:styleId="DefaultParagraphFont">
     <w:name w:val="Default Paragraph Font"/>
     <w:uiPriority w:val="1"/>
-    <w:semiHidden/>
     <w:unhideWhenUsed/>
   </w:style>
   <w:style w:type="table" w:default="1" w:styleId="TableNormal">
@@ -1330,6 +1382,18 @@
     <w:rPr>
       <w:color w:val="605E5C"/>
       <w:shd w:val="clear" w:color="auto" w:fill="E1DFDD"/>
+    </w:rPr>
+  </w:style>
+  <w:style w:type="character" w:styleId="FollowedHyperlink">
+    <w:name w:val="FollowedHyperlink"/>
+    <w:basedOn w:val="DefaultParagraphFont"/>
+    <w:uiPriority w:val="99"/>
+    <w:semiHidden/>
+    <w:unhideWhenUsed/>
+    <w:rsid w:val="009D4416"/>
+    <w:rPr>
+      <w:color w:val="954F72" w:themeColor="followedHyperlink"/>
+      <w:u w:val="single"/>
     </w:rPr>
   </w:style>
 </w:styles>

</xml_diff>

<commit_message>
added Samsung TRIM deletion files
</commit_message>
<xml_diff>
--- a/Literature.docx
+++ b/Literature.docx
@@ -590,6 +590,22 @@
       <w:proofErr w:type="gramEnd"/>
       <w:r>
         <w:t>10i2.12256.</w:t>
+      </w:r>
+    </w:p>
+    <w:p>
+      <w:r>
+        <w:t xml:space="preserve">Kessler, G. and Carlton, G. (2014). A Study of Forensic Imaging in the Absence of Write-Blockers A Study of Forensic Imaging in the Absence of Write-Blockers A Study of Forensic Imaging in the Absence of… JDFSL V9N3 A STUDY OF FORENSIC IMAGING IN THE ABSENCE OF WRITE-BLOCKERS. [online] Available at: </w:t>
+      </w:r>
+      <w:hyperlink r:id="rId7" w:history="1">
+        <w:r>
+          <w:rPr>
+            <w:rStyle w:val="Hyperlink"/>
+          </w:rPr>
+          <w:t>https://commons.erau.edu/cgi/viewcontent.cgi?article=1027&amp;context=db-security-studies</w:t>
+        </w:r>
+      </w:hyperlink>
+      <w:r>
+        <w:t>.</w:t>
       </w:r>
     </w:p>
     <w:p/>

</xml_diff>

<commit_message>
updated files and references from today
</commit_message>
<xml_diff>
--- a/Literature.docx
+++ b/Literature.docx
@@ -666,6 +666,102 @@
         <w:t>, pp.148–158. doi:10.1145/3767110.3767138.</w:t>
       </w:r>
     </w:p>
+    <w:p>
+      <w:proofErr w:type="spellStart"/>
+      <w:r>
+        <w:t>Qbea’h</w:t>
+      </w:r>
+      <w:proofErr w:type="spellEnd"/>
+      <w:r>
+        <w:t xml:space="preserve">, M., Al Ahbabi, A., </w:t>
+      </w:r>
+      <w:proofErr w:type="spellStart"/>
+      <w:r>
+        <w:t>Alketbi</w:t>
+      </w:r>
+      <w:proofErr w:type="spellEnd"/>
+      <w:r>
+        <w:t xml:space="preserve">, F. and </w:t>
+      </w:r>
+      <w:proofErr w:type="spellStart"/>
+      <w:r>
+        <w:t>Aldhanhani</w:t>
+      </w:r>
+      <w:proofErr w:type="spellEnd"/>
+      <w:r>
+        <w:t xml:space="preserve">, F. (2025). Recovering file extensions, deleted files, and encrypted data after windows malware attacks: Methods, tools, and forensic considerations. In: </w:t>
+      </w:r>
+      <w:r>
+        <w:rPr>
+          <w:i/>
+          <w:iCs/>
+        </w:rPr>
+        <w:t>2025 International Conference on Computer and Applications (ICCA)</w:t>
+      </w:r>
+      <w:r>
+        <w:t>. pp.1–7. doi:10.1109/ICCA66035.2025.11430806.</w:t>
+      </w:r>
+    </w:p>
+    <w:p>
+      <w:proofErr w:type="spellStart"/>
+      <w:r>
+        <w:t>Zhetpisbayeva</w:t>
+      </w:r>
+      <w:proofErr w:type="spellEnd"/>
+      <w:r>
+        <w:t xml:space="preserve">, A., </w:t>
+      </w:r>
+      <w:proofErr w:type="spellStart"/>
+      <w:r>
+        <w:t>Shayea</w:t>
+      </w:r>
+      <w:proofErr w:type="spellEnd"/>
+      <w:r>
+        <w:t xml:space="preserve">, I., </w:t>
+      </w:r>
+      <w:proofErr w:type="spellStart"/>
+      <w:r>
+        <w:t>Kozhakhmet</w:t>
+      </w:r>
+      <w:proofErr w:type="spellEnd"/>
+      <w:r>
+        <w:t>, Z., Alibek, A., Nyssanov, N. and Baibussinov, A. (2025). The Effect of TRIM Function on Data Recovery from SSD Solid-State Drives. </w:t>
+      </w:r>
+      <w:r>
+        <w:rPr>
+          <w:i/>
+          <w:iCs/>
+        </w:rPr>
+        <w:t>2025 IEEE/ACIS 29th International Conference on Software Engineering, Artificial Intelligence, Networking and Parallel/Distributed Computing (SNPD)</w:t>
+      </w:r>
+      <w:r>
+        <w:t>, pp.151–156. doi:10.1109/snpd65828.2025.11254695.</w:t>
+      </w:r>
+    </w:p>
+    <w:p>
+      <w:r>
+        <w:t xml:space="preserve">Shin, I. (2012). Implementing secure file deletion in </w:t>
+      </w:r>
+      <w:proofErr w:type="spellStart"/>
+      <w:r>
+        <w:t>NANDbased</w:t>
+      </w:r>
+      <w:proofErr w:type="spellEnd"/>
+      <w:r>
+        <w:t xml:space="preserve"> block devices with internal buffers. </w:t>
+      </w:r>
+      <w:r>
+        <w:rPr>
+          <w:i/>
+          <w:iCs/>
+        </w:rPr>
+        <w:t>IEEE Transactions on Consumer Electronics</w:t>
+      </w:r>
+      <w:r>
+        <w:t>, 58(4), pp.1219–1224. doi:10.1109/tce.2012.6414988.</w:t>
+      </w:r>
+    </w:p>
+    <w:p/>
     <w:p/>
     <w:p/>
     <w:p/>

</xml_diff>